<commit_message>
prb adversary-complaint: typst and docx on the shared cross-engine layout model, Liberation Mono 12 pt on both (the audited exemplar face, Courier New's twin; Times New Roman needs a template_face ruling in data/exemplar-fonts.json, OPEN), 24 pt double pitch, 13.8 pt single lines; the caption's rules as cell and paragraph borders; '§§' bound to its number; the WHEREFORE lead-in unnumbered in the docx too; build-reference.sh and the EB Garamond reference.docx give way to docx/reference.xml (base="xengine", {font}, Numbered Paragraph and Lettered Item); docx XENG-001..003 pass (293/293 lines), params.cross_engine: gate; check.sh typst 8 passed 0 failed, docx 1 failed -> 12 passed 0 failed (fb-595.68.17)
</commit_message>
<xml_diff>
--- a/courts/first-circuit/puerto-rico/federal/bankruptcy-district/adversary-complaint/usage/OUTPUT-adversary-complaint.docx
+++ b/courts/first-circuit/puerto-rico/federal/bankruptcy-district/adversary-complaint/usage/OUTPUT-adversary-complaint.docx
@@ -4,38 +4,159 @@
   <w:body>
     <w:p>
       <w:pPr>
-        <w:pStyle w:val="CourtTitle"/>
-      </w:pPr>
-      <w:r>
-        <w:t xml:space="preserve">United States Bankruptcy Court</w:t>
-      </w:r>
-    </w:p>
-    <w:p>
-      <w:pPr>
-        <w:pStyle w:val="CourtTitleLast"/>
-      </w:pPr>
-      <w:r>
-        <w:t xml:space="preserve">for the District of Puerto Rico</w:t>
+        <w:keepNext/>
+        <w:keepLines/>
+        <w:spacing w:before="0" w:after="0" w:line="276" w:lineRule="exact"/>
+        <w:ind w:left="0" w:firstLine="0"/>
+        <w:jc w:val="center"/>
+      </w:pPr>
+      <w:r>
+        <w:rPr>
+          <w:b/>
+          <w:bCs/>
+        </w:rPr>
+        <w:t xml:space="preserve">UNITED</w:t>
+      </w:r>
+      <w:r>
+        <w:rPr>
+          <w:b/>
+          <w:bCs/>
+        </w:rPr>
+        <w:t xml:space="preserve"> </w:t>
+      </w:r>
+      <w:r>
+        <w:rPr>
+          <w:b/>
+          <w:bCs/>
+        </w:rPr>
+        <w:t xml:space="preserve">STATES</w:t>
+      </w:r>
+      <w:r>
+        <w:rPr>
+          <w:b/>
+          <w:bCs/>
+        </w:rPr>
+        <w:t xml:space="preserve"> </w:t>
+      </w:r>
+      <w:r>
+        <w:rPr>
+          <w:b/>
+          <w:bCs/>
+        </w:rPr>
+        <w:t xml:space="preserve">BANKRUPTCY</w:t>
+      </w:r>
+      <w:r>
+        <w:rPr>
+          <w:b/>
+          <w:bCs/>
+        </w:rPr>
+        <w:t xml:space="preserve"> </w:t>
+      </w:r>
+      <w:r>
+        <w:rPr>
+          <w:b/>
+          <w:bCs/>
+        </w:rPr>
+        <w:t xml:space="preserve">COURT</w:t>
+      </w:r>
+    </w:p>
+    <w:p>
+      <w:pPr>
+        <w:keepNext/>
+        <w:keepLines/>
+        <w:spacing w:before="0" w:after="0" w:line="276" w:lineRule="exact"/>
+        <w:ind w:left="0" w:firstLine="0"/>
+        <w:jc w:val="center"/>
+      </w:pPr>
+      <w:r>
+        <w:rPr>
+          <w:b/>
+          <w:bCs/>
+        </w:rPr>
+        <w:t xml:space="preserve">FOR</w:t>
+      </w:r>
+      <w:r>
+        <w:rPr>
+          <w:b/>
+          <w:bCs/>
+        </w:rPr>
+        <w:t xml:space="preserve"> </w:t>
+      </w:r>
+      <w:r>
+        <w:rPr>
+          <w:b/>
+          <w:bCs/>
+        </w:rPr>
+        <w:t xml:space="preserve">THE</w:t>
+      </w:r>
+      <w:r>
+        <w:rPr>
+          <w:b/>
+          <w:bCs/>
+        </w:rPr>
+        <w:t xml:space="preserve"> </w:t>
+      </w:r>
+      <w:r>
+        <w:rPr>
+          <w:b/>
+          <w:bCs/>
+        </w:rPr>
+        <w:t xml:space="preserve">DISTRICT</w:t>
+      </w:r>
+      <w:r>
+        <w:rPr>
+          <w:b/>
+          <w:bCs/>
+        </w:rPr>
+        <w:t xml:space="preserve"> </w:t>
+      </w:r>
+      <w:r>
+        <w:rPr>
+          <w:b/>
+          <w:bCs/>
+        </w:rPr>
+        <w:t xml:space="preserve">OF</w:t>
+      </w:r>
+      <w:r>
+        <w:rPr>
+          <w:b/>
+          <w:bCs/>
+        </w:rPr>
+        <w:t xml:space="preserve"> </w:t>
+      </w:r>
+      <w:r>
+        <w:rPr>
+          <w:b/>
+          <w:bCs/>
+        </w:rPr>
+        <w:t xml:space="preserve">PUERTO</w:t>
+      </w:r>
+      <w:r>
+        <w:rPr>
+          <w:b/>
+          <w:bCs/>
+        </w:rPr>
+        <w:t xml:space="preserve"> </w:t>
+      </w:r>
+      <w:r>
+        <w:rPr>
+          <w:b/>
+          <w:bCs/>
+        </w:rPr>
+        <w:t xml:space="preserve">RICO</w:t>
       </w:r>
     </w:p>
     <w:tbl>
       <w:tblPr>
         <w:tblW w:w="9360" w:type="dxa"/>
-        <w:tblInd w:w="0" w:type="dxa"/>
-        <w:tblBorders>
-          <w:top w:val="nil"/>
-          <w:left w:val="nil"/>
-          <w:bottom w:val="nil"/>
-          <w:right w:val="nil"/>
-          <w:insideH w:val="nil"/>
-          <w:insideV w:val="nil"/>
-        </w:tblBorders>
         <w:tblLayout w:type="fixed"/>
         <w:tblCellMar>
+          <w:top w:w="0" w:type="dxa"/>
           <w:left w:w="0" w:type="dxa"/>
+          <w:bottom w:w="0" w:type="dxa"/>
           <w:right w:w="0" w:type="dxa"/>
         </w:tblCellMar>
-        <w:tblLook w:val="0000"/>
+        <w:tblLook w:val="0000" w:firstRow="0" w:lastRow="0" w:firstColumn="0" w:lastColumn="0" w:noHBand="0" w:noVBand="0"/>
       </w:tblPr>
       <w:tblGrid>
         <w:gridCol w:w="4896"/>
@@ -60,7 +181,9 @@
           </w:tcPr>
           <w:p>
             <w:pPr>
-              <w:pStyle w:val="CaptionText"/>
+              <w:spacing w:before="480" w:after="0" w:line="276" w:lineRule="exact"/>
+              <w:ind w:left="0" w:firstLine="0"/>
+              <w:jc w:val="left"/>
             </w:pPr>
             <w:r>
               <w:t xml:space="preserve">In re:</w:t>
@@ -68,15 +191,34 @@
           </w:p>
           <w:p>
             <w:pPr>
-              <w:pStyle w:val="CaptionText"/>
+              <w:spacing w:before="0" w:after="0" w:line="276" w:lineRule="exact"/>
+              <w:ind w:left="0" w:firstLine="0"/>
+              <w:jc w:val="left"/>
             </w:pPr>
             <w:r>
-              <w:t xml:space="preserve">ORGANIC POWER, LLC.</w:t>
+              <w:t xml:space="preserve">ORGANIC</w:t>
+            </w:r>
+            <w:r>
+              <w:t xml:space="preserve"> </w:t>
+            </w:r>
+            <w:r>
+              <w:t xml:space="preserve">POWER,</w:t>
+            </w:r>
+            <w:r>
+              <w:t xml:space="preserve"> </w:t>
+            </w:r>
+            <w:r>
+              <w:t xml:space="preserve">LLC.</w:t>
             </w:r>
           </w:p>
           <w:p>
             <w:pPr>
-              <w:pStyle w:val="CaptionText"/>
+              <w:pBdr>
+                <w:bottom w:val="single" w:sz="6" w:space="0" w:color="000000"/>
+              </w:pBdr>
+              <w:spacing w:before="0" w:after="0" w:line="276" w:lineRule="exact"/>
+              <w:ind w:left="0" w:firstLine="0"/>
+              <w:jc w:val="left"/>
             </w:pPr>
             <w:r>
               <w:t xml:space="preserve">Debtor.</w:t>
@@ -84,44 +226,163 @@
           </w:p>
           <w:p>
             <w:pPr>
-              <w:pStyle w:val="CaptionRule"/>
+              <w:spacing w:before="123" w:after="0" w:line="276" w:lineRule="exact"/>
+              <w:ind w:left="0" w:firstLine="0"/>
+              <w:jc w:val="left"/>
             </w:pPr>
+            <w:r>
+              <w:t xml:space="preserve">ORGANIC</w:t>
+            </w:r>
+            <w:r>
+              <w:t xml:space="preserve"> </w:t>
+            </w:r>
+            <w:r>
+              <w:t xml:space="preserve">POWER,</w:t>
+            </w:r>
+            <w:r>
+              <w:t xml:space="preserve"> </w:t>
+            </w:r>
+            <w:r>
+              <w:t xml:space="preserve">LLC.</w:t>
+            </w:r>
           </w:p>
           <w:p>
             <w:pPr>
-              <w:pStyle w:val="CaptionText"/>
+              <w:spacing w:before="0" w:after="0" w:line="276" w:lineRule="exact"/>
+              <w:ind w:left="0" w:firstLine="0"/>
+              <w:jc w:val="left"/>
             </w:pPr>
             <w:r>
-              <w:t xml:space="preserve">ORGANIC POWER, LLC.</w:t>
+              <w:t xml:space="preserve">Plaintiff</w:t>
             </w:r>
           </w:p>
           <w:p>
             <w:pPr>
-              <w:pStyle w:val="CaptionText"/>
+              <w:spacing w:before="0" w:after="0" w:line="276" w:lineRule="exact"/>
+              <w:ind w:left="0" w:firstLine="0"/>
+              <w:jc w:val="left"/>
             </w:pPr>
             <w:r>
-              <w:t xml:space="preserve">Plaintiff</w:t>
+              <w:t xml:space="preserve">v.</w:t>
             </w:r>
           </w:p>
           <w:p>
             <w:pPr>
-              <w:pStyle w:val="CaptionText"/>
+              <w:spacing w:before="0" w:after="0" w:line="276" w:lineRule="exact"/>
+              <w:ind w:left="0" w:firstLine="0"/>
+              <w:jc w:val="left"/>
             </w:pPr>
             <w:r>
-              <w:t xml:space="preserve">v.</w:t>
+              <w:t xml:space="preserve">The</w:t>
+            </w:r>
+            <w:r>
+              <w:t xml:space="preserve"> </w:t>
+            </w:r>
+            <w:r>
+              <w:t xml:space="preserve">U.S.</w:t>
+            </w:r>
+            <w:r>
+              <w:t xml:space="preserve"> </w:t>
+            </w:r>
+            <w:r>
+              <w:t xml:space="preserve">Small</w:t>
+            </w:r>
+            <w:r>
+              <w:t xml:space="preserve"> </w:t>
+            </w:r>
+            <w:r>
+              <w:t xml:space="preserve">Business</w:t>
+            </w:r>
+            <w:r>
+              <w:t xml:space="preserve"> </w:t>
+            </w:r>
+            <w:r>
+              <w:t xml:space="preserve">Administration</w:t>
+            </w:r>
+            <w:r>
+              <w:t xml:space="preserve"> </w:t>
+            </w:r>
+            <w:r>
+              <w:t xml:space="preserve">and</w:t>
+            </w:r>
+            <w:r>
+              <w:t xml:space="preserve"> </w:t>
+            </w:r>
+            <w:r>
+              <w:t xml:space="preserve">Jovita</w:t>
+            </w:r>
+            <w:r>
+              <w:t xml:space="preserve"> </w:t>
+            </w:r>
+            <w:r>
+              <w:t xml:space="preserve">Carranza,</w:t>
+            </w:r>
+            <w:r>
+              <w:t xml:space="preserve"> </w:t>
+            </w:r>
+            <w:r>
+              <w:t xml:space="preserve">solely</w:t>
+            </w:r>
+            <w:r>
+              <w:t xml:space="preserve"> </w:t>
+            </w:r>
+            <w:r>
+              <w:t xml:space="preserve">as</w:t>
+            </w:r>
+            <w:r>
+              <w:t xml:space="preserve"> </w:t>
+            </w:r>
+            <w:r>
+              <w:t xml:space="preserve">the</w:t>
+            </w:r>
+            <w:r>
+              <w:t xml:space="preserve"> </w:t>
+            </w:r>
+            <w:r>
+              <w:t xml:space="preserve">Administrator</w:t>
+            </w:r>
+            <w:r>
+              <w:t xml:space="preserve"> </w:t>
+            </w:r>
+            <w:r>
+              <w:t xml:space="preserve">of</w:t>
+            </w:r>
+            <w:r>
+              <w:t xml:space="preserve"> </w:t>
+            </w:r>
+            <w:r>
+              <w:t xml:space="preserve">the</w:t>
+            </w:r>
+            <w:r>
+              <w:t xml:space="preserve"> </w:t>
+            </w:r>
+            <w:r>
+              <w:t xml:space="preserve">U.S.</w:t>
+            </w:r>
+            <w:r>
+              <w:t xml:space="preserve"> </w:t>
+            </w:r>
+            <w:r>
+              <w:t xml:space="preserve">Small</w:t>
+            </w:r>
+            <w:r>
+              <w:t xml:space="preserve"> </w:t>
+            </w:r>
+            <w:r>
+              <w:t xml:space="preserve">Business</w:t>
+            </w:r>
+            <w:r>
+              <w:t xml:space="preserve"> </w:t>
+            </w:r>
+            <w:r>
+              <w:t xml:space="preserve">Administration,</w:t>
             </w:r>
           </w:p>
           <w:p>
             <w:pPr>
-              <w:pStyle w:val="CaptionText"/>
-            </w:pPr>
-            <w:r>
-              <w:t xml:space="preserve">The U.S. Small Business Administration and Jovita Carranza, solely as the Administrator of the U.S. Small Business Administration,</w:t>
-            </w:r>
-          </w:p>
-          <w:p>
-            <w:pPr>
-              <w:pStyle w:val="CaptionText"/>
+              <w:spacing w:before="0" w:after="0" w:line="276" w:lineRule="exact"/>
+              <w:ind w:left="0" w:firstLine="0"/>
+              <w:jc w:val="left"/>
             </w:pPr>
             <w:r>
               <w:t xml:space="preserve">Defendant</w:t>
@@ -132,7 +393,13 @@
           <w:tcPr>
             <w:tcW w:w="288" w:type="dxa"/>
           </w:tcPr>
-          <w:p/>
+          <w:p>
+            <w:pPr>
+              <w:spacing w:before="480" w:after="0" w:line="276" w:lineRule="exact"/>
+              <w:ind w:left="0" w:firstLine="0"/>
+              <w:jc w:val="left"/>
+            </w:pPr>
+          </w:p>
         </w:tc>
         <w:tc>
           <w:tcPr>
@@ -143,26 +410,46 @@
           </w:tcPr>
           <w:p>
             <w:pPr>
-              <w:pStyle w:val="CaptionText"/>
+              <w:spacing w:before="480" w:after="0" w:line="276" w:lineRule="exact"/>
+              <w:ind w:left="0" w:firstLine="0"/>
+              <w:jc w:val="left"/>
             </w:pPr>
             <w:r>
               <w:t xml:space="preserve">Bankr. Case No. </w:t>
             </w:r>
             <w:r>
-              <w:t xml:space="preserve">19-01789 (ESL)</w:t>
+              <w:t xml:space="preserve">19</w:t>
+              <w:noBreakHyphen/>
+              <w:t xml:space="preserve">01789</w:t>
+            </w:r>
+            <w:r>
+              <w:t xml:space="preserve"> </w:t>
+            </w:r>
+            <w:r>
+              <w:t xml:space="preserve">(ESL)</w:t>
             </w:r>
           </w:p>
           <w:p>
             <w:pPr>
-              <w:pStyle w:val="CaptionText"/>
+              <w:spacing w:before="0" w:after="0" w:line="276" w:lineRule="exact"/>
+              <w:ind w:left="0" w:firstLine="0"/>
+              <w:jc w:val="left"/>
             </w:pPr>
             <w:r>
-              <w:t xml:space="preserve">Chapter 11</w:t>
+              <w:t xml:space="preserve">Chapter</w:t>
+            </w:r>
+            <w:r>
+              <w:t xml:space="preserve"> </w:t>
+            </w:r>
+            <w:r>
+              <w:t xml:space="preserve">11</w:t>
             </w:r>
           </w:p>
           <w:p>
             <w:pPr>
-              <w:pStyle w:val="CaptionText"/>
+              <w:spacing w:before="0" w:after="0" w:line="276" w:lineRule="exact"/>
+              <w:ind w:left="0" w:firstLine="0"/>
+              <w:jc w:val="left"/>
             </w:pPr>
             <w:r>
               <w:t xml:space="preserve">Adv. Proceeding No. </w:t>
@@ -176,37 +463,210 @@
     </w:tbl>
     <w:p>
       <w:pPr>
-        <w:pStyle w:val="CaptionTitle"/>
-      </w:pPr>
-      <w:r>
-        <w:t xml:space="preserve">COMPLAINT FOR DECLARATORY JUDGMENT, WRIT OF MANDAMUS, AND INJUNCTIVE RELIEF</w:t>
-      </w:r>
-    </w:p>
-    <w:p>
-      <w:pPr>
-        <w:pStyle w:val="CourtHeading"/>
-      </w:pPr>
-      <w:r>
+        <w:keepNext/>
+        <w:keepLines/>
+        <w:spacing w:before="480" w:after="276" w:line="276" w:lineRule="exact"/>
+        <w:ind w:left="0" w:firstLine="0"/>
+        <w:jc w:val="center"/>
+      </w:pPr>
+      <w:r>
+        <w:rPr>
+          <w:b/>
+          <w:bCs/>
+        </w:rPr>
+        <w:t xml:space="preserve">COMPLAINT</w:t>
+      </w:r>
+      <w:r>
+        <w:rPr>
+          <w:b/>
+          <w:bCs/>
+        </w:rPr>
+        <w:t xml:space="preserve"> </w:t>
+      </w:r>
+      <w:r>
+        <w:rPr>
+          <w:b/>
+          <w:bCs/>
+        </w:rPr>
+        <w:t xml:space="preserve">FOR</w:t>
+      </w:r>
+      <w:r>
+        <w:rPr>
+          <w:b/>
+          <w:bCs/>
+        </w:rPr>
+        <w:t xml:space="preserve"> </w:t>
+      </w:r>
+      <w:r>
+        <w:rPr>
+          <w:b/>
+          <w:bCs/>
+        </w:rPr>
+        <w:t xml:space="preserve">DECLARATORY</w:t>
+      </w:r>
+      <w:r>
+        <w:rPr>
+          <w:b/>
+          <w:bCs/>
+        </w:rPr>
+        <w:t xml:space="preserve"> </w:t>
+      </w:r>
+      <w:r>
+        <w:rPr>
+          <w:b/>
+          <w:bCs/>
+        </w:rPr>
+        <w:t xml:space="preserve">JUDGMENT,</w:t>
+      </w:r>
+      <w:r>
+        <w:rPr>
+          <w:b/>
+          <w:bCs/>
+        </w:rPr>
+        <w:t xml:space="preserve"> </w:t>
+      </w:r>
+      <w:r>
+        <w:rPr>
+          <w:b/>
+          <w:bCs/>
+        </w:rPr>
+        <w:t xml:space="preserve">WRIT</w:t>
+      </w:r>
+      <w:r>
+        <w:rPr>
+          <w:b/>
+          <w:bCs/>
+        </w:rPr>
+        <w:t xml:space="preserve"> </w:t>
+      </w:r>
+      <w:r>
+        <w:rPr>
+          <w:b/>
+          <w:bCs/>
+        </w:rPr>
+        <w:t xml:space="preserve">OF</w:t>
+      </w:r>
+      <w:r>
+        <w:rPr>
+          <w:b/>
+          <w:bCs/>
+        </w:rPr>
+        <w:t xml:space="preserve"> </w:t>
+      </w:r>
+      <w:r>
+        <w:rPr>
+          <w:b/>
+          <w:bCs/>
+        </w:rPr>
+        <w:t xml:space="preserve">MANDAMUS,</w:t>
+      </w:r>
+      <w:r>
+        <w:rPr>
+          <w:b/>
+          <w:bCs/>
+        </w:rPr>
+        <w:t xml:space="preserve"> </w:t>
+      </w:r>
+      <w:r>
+        <w:rPr>
+          <w:b/>
+          <w:bCs/>
+        </w:rPr>
+        <w:t xml:space="preserve">AND</w:t>
+      </w:r>
+      <w:r>
+        <w:rPr>
+          <w:b/>
+          <w:bCs/>
+        </w:rPr>
+        <w:t xml:space="preserve"> </w:t>
+      </w:r>
+      <w:r>
+        <w:rPr>
+          <w:b/>
+          <w:bCs/>
+        </w:rPr>
+        <w:t xml:space="preserve">INJUNCTIVE</w:t>
+      </w:r>
+      <w:r>
+        <w:rPr>
+          <w:b/>
+          <w:bCs/>
+        </w:rPr>
+        <w:t xml:space="preserve"> </w:t>
+      </w:r>
+      <w:r>
+        <w:rPr>
+          <w:b/>
+          <w:bCs/>
+        </w:rPr>
+        <w:t xml:space="preserve">RELIEF</w:t>
+      </w:r>
+    </w:p>
+    <w:p>
+      <w:pPr>
+        <w:keepNext/>
+        <w:keepLines/>
+        <w:spacing w:before="0" w:after="0" w:line="480" w:lineRule="exact"/>
+        <w:ind w:left="0" w:firstLine="0"/>
+        <w:jc w:val="left"/>
+      </w:pPr>
+      <w:r>
+        <w:rPr>
+          <w:b/>
+          <w:bCs/>
+        </w:rPr>
         <w:t xml:space="preserve">TO THE HONORABLE COURT:</w:t>
       </w:r>
     </w:p>
     <w:p>
       <w:pPr>
-        <w:pStyle w:val="FirstParagraph"/>
-      </w:pPr>
-      <w:r>
-        <w:t xml:space="preserve">COME NOW, Organic Power, LLC. (“OP” or “Debtor”), through the undersigned counsel very respectfully avers and prays as follows:</w:t>
+        <w:pStyle w:val="BodyText"/>
+      </w:pPr>
+      <w:r>
+        <w:rPr>
+          <w:b/>
+          <w:bCs/>
+        </w:rPr>
+        <w:t xml:space="preserve">COME NOW,</w:t>
+      </w:r>
+      <w:r>
+        <w:t xml:space="preserve"> </w:t>
+      </w:r>
+      <w:r>
+        <w:t xml:space="preserve">Organic Power, LLC. (“OP” or “Debtor”), through the undersigned counsel very respectfully avers and prays as follows:</w:t>
       </w:r>
     </w:p>
     <w:p>
       <w:pPr>
         <w:pStyle w:val="Heading1"/>
-      </w:pPr>
-      <w:bookmarkStart w:id="9" w:name="_f990d51b53e36c17355a6666bd6589b8aa26857"/>
-      <w:r>
-        <w:t xml:space="preserve">I. Introduction</w:t>
-      </w:r>
-      <w:bookmarkEnd w:id="9"/>
+        <w:keepNext/>
+        <w:keepLines/>
+        <w:spacing w:before="0" w:after="0" w:line="480" w:lineRule="exact"/>
+        <w:ind w:left="0" w:firstLine="0"/>
+        <w:jc w:val="left"/>
+      </w:pPr>
+      <w:r>
+        <w:rPr>
+          <w:b/>
+          <w:bCs/>
+        </w:rPr>
+        <w:t xml:space="preserve">I.</w:t>
+      </w:r>
+      <w:r>
+        <w:rPr>
+          <w:b/>
+          <w:bCs/>
+        </w:rPr>
+        <w:t xml:space="preserve"> </w:t>
+      </w:r>
+      <w:r>
+        <w:rPr>
+          <w:b/>
+          <w:bCs/>
+        </w:rPr>
+        <w:t xml:space="preserve">INTRODUCTION</w:t>
+      </w:r>
     </w:p>
     <w:p>
       <w:pPr>
@@ -233,7 +693,13 @@
         <w:tab/>
       </w:r>
       <w:r>
-        <w:t xml:space="preserve">The PPP and its associated benefits are intended to provide economic relief to small businesses nationwide who are adversely impacted under the Coronavirus Disease 2019 (“COVID-19”) Emergency Declaration issued by President Donald Trump on March 13, 2020.</w:t>
+        <w:t xml:space="preserve">The PPP and its associated benefits are intended to provide economic relief to small businesses nationwide who are adversely impacted under the Coronavirus Disease 2019 (“COVID</w:t>
+      </w:r>
+      <w:r>
+        <w:noBreakHyphen/>
+      </w:r>
+      <w:r>
+        <w:t xml:space="preserve">19”) Emergency Declaration issued by President Donald Trump on March 13, 2020.</w:t>
       </w:r>
     </w:p>
     <w:p>
@@ -247,7 +713,7 @@
         <w:tab/>
       </w:r>
       <w:r>
-        <w:t xml:space="preserve">This is an action against the SBA under the Administrative Procedure Act, 5 U.S.C. §701 et seq. and section 525 of the United States Bankruptcy Code, 11 U.S.C. §525, seeking: (a) a declaratory judgment that the SBA’s implementation of the PPP against prospective borrowers who are debtors in bankruptcy is unlawful, discriminatory, and beyond its statutory authority; (b) a writ of mandamus under 28 U.S.C. § 1361 to compel the SBA to remove its disqualification of bankruptcy debtors as viable applicants from all PPP applications, including the PPP Official SBA Form 2484 (the “PPP Application”); and (c) an order enjoining the SBA from denying the Plaintiff a loan under the PPP based on the Plaintiff’s status as a chapter 11 debtor.</w:t>
+        <w:t xml:space="preserve">This is an action against the SBA under the Administrative Procedure Act, 5 U.S.C. §701 et seq. and section 525 of the United States Bankruptcy Code, 11 U.S.C. §525, seeking: (a) a declaratory judgment that the SBA’s implementation of the PPP against prospective borrowers who are debtors in bankruptcy is unlawful, discriminatory, and beyond its statutory authority; (b) a writ of mandamus under 28 U.S.C. § 1361 to compel the SBA to remove its disqualification of bankruptcy debtors as viable applicants from all PPP applications, including the PPP Official SBA Form 2484 (the “PPP Application”); and (c) an order enjoining the SBA from denying the Plaintiff a loan under the PPP based on the Plaintiff’s status as a chapter 11 debtor.</w:t>
       </w:r>
     </w:p>
     <w:p>
@@ -274,7 +740,13 @@
         <w:t xml:space="preserve">In re Asteria Education, Inc.</w:t>
       </w:r>
       <w:r>
-        <w:t xml:space="preserve">, Dkt. 129, Case No. 20-50169 (Bankr. W.D. Tex., April 8, 2020). (“In the context of the CARES Act or the Interim Final Rules, as they apply to the Debtor, there is no such prohibition with regard to debtor under Chapter 11 of title 11 being the recipient of a loan under the revised SBA 7(a) program known as the PPP or under the EIDL program portions of the CARES Act.”); See also, Temporary Restraining Order,</w:t>
+        <w:t xml:space="preserve">, Dkt. 129, Case No. 20</w:t>
+      </w:r>
+      <w:r>
+        <w:noBreakHyphen/>
+      </w:r>
+      <w:r>
+        <w:t xml:space="preserve">50169 (Bankr. W.D. Tex., April 8, 2020). (“In the context of the CARES Act or the Interim Final Rules, as they apply to the Debtor, there is no such prohibition with regard to debtor under Chapter 11 of title 11 being the recipient of a loan under the revised SBA 7(a) program known as the PPP or under the EIDL program portions of the CARES Act.”); See also, Temporary Restraining Order,</w:t>
       </w:r>
       <w:r>
         <w:t xml:space="preserve"> </w:t>
@@ -287,7 +759,13 @@
         <w:t xml:space="preserve">In re Hidalgo County Emergency Service</w:t>
       </w:r>
       <w:r>
-        <w:t xml:space="preserve">, Case No. 19-20497;</w:t>
+        <w:t xml:space="preserve">, Case No. 19</w:t>
+      </w:r>
+      <w:r>
+        <w:noBreakHyphen/>
+      </w:r>
+      <w:r>
+        <w:t xml:space="preserve">20497;</w:t>
       </w:r>
       <w:r>
         <w:t xml:space="preserve"> </w:t>
@@ -300,18 +778,59 @@
         <w:t xml:space="preserve">Hidalgo County Emergency Service Foundation v. Jovita Carranza in her capacity as Administrator of the U.S. Small Business Administration</w:t>
       </w:r>
       <w:r>
-        <w:t xml:space="preserve">, Dkt. 18, Adv. Proc. 20-02006 (Bankr. S.D. Tex., April 25, 2020).</w:t>
+        <w:t xml:space="preserve">, Dkt. 18, Adv. Proc. 20</w:t>
+      </w:r>
+      <w:r>
+        <w:noBreakHyphen/>
+      </w:r>
+      <w:r>
+        <w:t xml:space="preserve">02006 (Bankr. S.D. Tex., April 25, 2020).</w:t>
       </w:r>
     </w:p>
     <w:p>
       <w:pPr>
         <w:pStyle w:val="Heading1"/>
-      </w:pPr>
-      <w:bookmarkStart w:id="10" w:name="_ddb87d4a097d12e27489904954a4517db4759f7"/>
-      <w:r>
-        <w:t xml:space="preserve">II. The Parties</w:t>
-      </w:r>
-      <w:bookmarkEnd w:id="10"/>
+        <w:keepNext/>
+        <w:keepLines/>
+        <w:spacing w:before="0" w:after="0" w:line="480" w:lineRule="exact"/>
+        <w:ind w:left="0" w:firstLine="0"/>
+        <w:jc w:val="left"/>
+      </w:pPr>
+      <w:r>
+        <w:rPr>
+          <w:b/>
+          <w:bCs/>
+        </w:rPr>
+        <w:t xml:space="preserve">II.</w:t>
+      </w:r>
+      <w:r>
+        <w:rPr>
+          <w:b/>
+          <w:bCs/>
+        </w:rPr>
+        <w:t xml:space="preserve"> </w:t>
+      </w:r>
+      <w:r>
+        <w:rPr>
+          <w:b/>
+          <w:bCs/>
+        </w:rPr>
+        <w:t xml:space="preserve">THE</w:t>
+      </w:r>
+      <w:r>
+        <w:rPr>
+          <w:b/>
+          <w:bCs/>
+        </w:rPr>
+        <w:t xml:space="preserve"> </w:t>
+      </w:r>
+      <w:r>
+        <w:rPr>
+          <w:b/>
+          <w:bCs/>
+        </w:rPr>
+        <w:t xml:space="preserve">PARTIES</w:t>
+      </w:r>
     </w:p>
     <w:p>
       <w:pPr>
@@ -344,12 +863,61 @@
     <w:p>
       <w:pPr>
         <w:pStyle w:val="Heading1"/>
-      </w:pPr>
-      <w:bookmarkStart w:id="11" w:name="_81af03f22b43424b870f78bb6bae7219ceaf413"/>
-      <w:r>
-        <w:t xml:space="preserve">III. Jurisdiction and Venue</w:t>
-      </w:r>
-      <w:bookmarkEnd w:id="11"/>
+        <w:keepNext/>
+        <w:keepLines/>
+        <w:spacing w:before="0" w:after="0" w:line="480" w:lineRule="exact"/>
+        <w:ind w:left="0" w:firstLine="0"/>
+        <w:jc w:val="left"/>
+      </w:pPr>
+      <w:r>
+        <w:rPr>
+          <w:b/>
+          <w:bCs/>
+        </w:rPr>
+        <w:t xml:space="preserve">III.</w:t>
+      </w:r>
+      <w:r>
+        <w:rPr>
+          <w:b/>
+          <w:bCs/>
+        </w:rPr>
+        <w:t xml:space="preserve"> </w:t>
+      </w:r>
+      <w:r>
+        <w:rPr>
+          <w:b/>
+          <w:bCs/>
+        </w:rPr>
+        <w:t xml:space="preserve">JURISDICTION</w:t>
+      </w:r>
+      <w:r>
+        <w:rPr>
+          <w:b/>
+          <w:bCs/>
+        </w:rPr>
+        <w:t xml:space="preserve"> </w:t>
+      </w:r>
+      <w:r>
+        <w:rPr>
+          <w:b/>
+          <w:bCs/>
+        </w:rPr>
+        <w:t xml:space="preserve">AND</w:t>
+      </w:r>
+      <w:r>
+        <w:rPr>
+          <w:b/>
+          <w:bCs/>
+        </w:rPr>
+        <w:t xml:space="preserve"> </w:t>
+      </w:r>
+      <w:r>
+        <w:rPr>
+          <w:b/>
+          <w:bCs/>
+        </w:rPr>
+        <w:t xml:space="preserve">VENUE</w:t>
+      </w:r>
     </w:p>
     <w:p>
       <w:pPr>
@@ -362,7 +930,7 @@
         <w:tab/>
       </w:r>
       <w:r>
-        <w:t xml:space="preserve">The Court has jurisdiction over this adversary proceeding pursuant to 28 U.S.C. §§157 and 1334. This is a core proceeding pursuant to 28 U.S.C. §157(b)(2)(D). Jurisdiction is also proper under the judicial review provisions of the Administrative Procedure Act (“APA”), 5 U.S.C. § 702.</w:t>
+        <w:t xml:space="preserve">The Court has jurisdiction over this adversary proceeding pursuant to 28 U.S.C. §§157 and 1334. This is a core proceeding pursuant to 28 U.S.C. §157(b)⁠(2)⁠(D). Jurisdiction is also proper under the judicial review provisions of the Administrative Procedure Act (“APA”), 5 U.S.C. § 702.</w:t>
       </w:r>
     </w:p>
     <w:p>
@@ -376,7 +944,7 @@
         <w:tab/>
       </w:r>
       <w:r>
-        <w:t xml:space="preserve">Declaratory and injunctive relief is sought consistent with 5 U.S.C. § 706 and as authorized in 28 U.S.C. § 2201 and 2202.</w:t>
+        <w:t xml:space="preserve">Declaratory and injunctive relief is sought consistent with 5 U.S.C. § 706 and as authorized in 28 U.S.C. § 2201 and 2202.</w:t>
       </w:r>
     </w:p>
     <w:p>
@@ -390,7 +958,7 @@
         <w:tab/>
       </w:r>
       <w:r>
-        <w:t xml:space="preserve">Venue is proper in this district pursuant to 28 U.S.C. §§ 1391(b)(2) and (e)(1) and 28 U.S.C. § 1409(a).</w:t>
+        <w:t xml:space="preserve">Venue is proper in this district pursuant to 28 U.S.C. §§ 1391(b)⁠(2) and (e)⁠(1) and 28 U.S.C. § 1409(a).</w:t>
       </w:r>
     </w:p>
     <w:p>
@@ -404,18 +972,53 @@
         <w:tab/>
       </w:r>
       <w:r>
-        <w:t xml:space="preserve">The Debtor states that it consents to the bankruptcy court hearing and determining all claims and issues in this adversary proceeding and entering final judgments and orders on all claims, including money judgments as appropriate, subject to review under 28 U.S.C. § 158.</w:t>
+        <w:t xml:space="preserve">The Debtor states that it consents to the bankruptcy court hearing and determining all claims and issues in this adversary proceeding and entering final judgments and orders on all claims, including money judgments as appropriate, subject to review under 28 U.S.C. § 158.</w:t>
       </w:r>
     </w:p>
     <w:p>
       <w:pPr>
         <w:pStyle w:val="Heading1"/>
-      </w:pPr>
-      <w:bookmarkStart w:id="12" w:name="_15a0d86acbabbd55fe65ec70cefa035b120e374"/>
-      <w:r>
-        <w:t xml:space="preserve">IV. Factual Background</w:t>
-      </w:r>
-      <w:bookmarkEnd w:id="12"/>
+        <w:keepNext/>
+        <w:keepLines/>
+        <w:spacing w:before="0" w:after="0" w:line="480" w:lineRule="exact"/>
+        <w:ind w:left="0" w:firstLine="0"/>
+        <w:jc w:val="left"/>
+      </w:pPr>
+      <w:r>
+        <w:rPr>
+          <w:b/>
+          <w:bCs/>
+        </w:rPr>
+        <w:t xml:space="preserve">IV.</w:t>
+      </w:r>
+      <w:r>
+        <w:rPr>
+          <w:b/>
+          <w:bCs/>
+        </w:rPr>
+        <w:t xml:space="preserve"> </w:t>
+      </w:r>
+      <w:r>
+        <w:rPr>
+          <w:b/>
+          <w:bCs/>
+        </w:rPr>
+        <w:t xml:space="preserve">FACTUAL</w:t>
+      </w:r>
+      <w:r>
+        <w:rPr>
+          <w:b/>
+          <w:bCs/>
+        </w:rPr>
+        <w:t xml:space="preserve"> </w:t>
+      </w:r>
+      <w:r>
+        <w:rPr>
+          <w:b/>
+          <w:bCs/>
+        </w:rPr>
+        <w:t xml:space="preserve">BACKGROUND</w:t>
+      </w:r>
     </w:p>
     <w:p>
       <w:pPr>
@@ -428,7 +1031,13 @@
         <w:tab/>
       </w:r>
       <w:r>
-        <w:t xml:space="preserve">On April 1, 2019 (the “Petition Date”), Plaintiff filed its voluntary petition for relief under Chapter 11 of the United States Bankruptcy Code in the United States Bankruptcy Court for the District of Puerto Rico, commencing the case captioned In Organic Power, LLC, Case No. 19-01789 (the “Chapter 11 Case”).</w:t>
+        <w:t xml:space="preserve">On April 1, 2019 (the “Petition Date”), Plaintiff filed its voluntary petition for relief under Chapter 11 of the United States Bankruptcy Code in the United States Bankruptcy Court for the District of Puerto Rico, commencing the case captioned In Organic Power, LLC, Case No. 19</w:t>
+      </w:r>
+      <w:r>
+        <w:noBreakHyphen/>
+      </w:r>
+      <w:r>
+        <w:t xml:space="preserve">01789 (the “Chapter 11 Case”).</w:t>
       </w:r>
     </w:p>
     <w:p>
@@ -470,7 +1079,7 @@
         <w:tab/>
       </w:r>
       <w:r>
-        <w:t xml:space="preserve">The PPP is set forth in Title I of the CARES Act and is a temporary, short-term program, and amends Section 7(a) of the Small Business Act (15 U.S.C. § 636(a)), the regulatory scheme through which the SBA guarantees covered loans.</w:t>
+        <w:t xml:space="preserve">The PPP is set forth in Title I of the CARES Act and is a temporary, short-term program, and amends Section 7(a) of the Small Business Act (15 U.S.C. § 636(a)), the regulatory scheme through which the SBA guarantees covered loans.</w:t>
       </w:r>
     </w:p>
     <w:p>
@@ -652,7 +1261,19 @@
         <w:tab/>
       </w:r>
       <w:r>
-        <w:t xml:space="preserve">The First Interim Rule adopts the standards set forth in section 120.110, title 13 of the Code of Federal Regulations (“CFR 120.110”), as further described in SBA’s Standard Operating Procedure 50-10, Subpart B, Chapter 2 (“SOP 50-10”). See First Interim Rule, 2(c) (“Businesses that are not eligible for PPP loans are identified in 13 CFR 120.110 and further described further in SBA’s Standard Operating Procedure”).</w:t>
+        <w:t xml:space="preserve">The First Interim Rule adopts the standards set forth in section 120.110, title 13 of the Code of Federal Regulations (“CFR 120.110”), as further described in SBA’s Standard Operating Procedure 50</w:t>
+      </w:r>
+      <w:r>
+        <w:noBreakHyphen/>
+      </w:r>
+      <w:r>
+        <w:t xml:space="preserve">10, Subpart B, Chapter 2 (“SOP 50</w:t>
+      </w:r>
+      <w:r>
+        <w:noBreakHyphen/>
+      </w:r>
+      <w:r>
+        <w:t xml:space="preserve">10”). See First Interim Rule, 2(c) (“Businesses that are not eligible for PPP loans are identified in 13 CFR 120.110 and further described further in SBA’s Standard Operating Procedure”).</w:t>
       </w:r>
     </w:p>
     <w:p>
@@ -666,7 +1287,19 @@
         <w:tab/>
       </w:r>
       <w:r>
-        <w:t xml:space="preserve">The SOP 50-10 provides, among other things, that a “Small Business Applicant” must: be operating a business; be located in the United States; be small (as defined by the SBA); and demonstrate the need for the desired credit. See SOP 50-10, pg. 85.</w:t>
+        <w:t xml:space="preserve">The SOP 50</w:t>
+      </w:r>
+      <w:r>
+        <w:noBreakHyphen/>
+      </w:r>
+      <w:r>
+        <w:t xml:space="preserve">10 provides, among other things, that a “Small Business Applicant” must: be operating a business; be located in the United States; be small (as defined by the SBA); and demonstrate the need for the desired credit. See SOP 50</w:t>
+      </w:r>
+      <w:r>
+        <w:noBreakHyphen/>
+      </w:r>
+      <w:r>
+        <w:t xml:space="preserve">10, pg. 85.</w:t>
       </w:r>
     </w:p>
     <w:p>
@@ -680,7 +1313,19 @@
         <w:tab/>
       </w:r>
       <w:r>
-        <w:t xml:space="preserve">The SOP 50-10 also provides that the businesses listed in CFR 120.110 are not eligible for an SBA loan. Bankruptcy debtors are not the listed as an ineligible business in CFR 120.110. Nothing else in the SOP 50-10 makes the Plaintiff ineligible for a PPP loan.</w:t>
+        <w:t xml:space="preserve">The SOP 50</w:t>
+      </w:r>
+      <w:r>
+        <w:noBreakHyphen/>
+      </w:r>
+      <w:r>
+        <w:t xml:space="preserve">10 also provides that the businesses listed in CFR 120.110 are not eligible for an SBA loan. Bankruptcy debtors are not the listed as an ineligible business in CFR 120.110. Nothing else in the SOP 50</w:t>
+      </w:r>
+      <w:r>
+        <w:noBreakHyphen/>
+      </w:r>
+      <w:r>
+        <w:t xml:space="preserve">10 makes the Plaintiff ineligible for a PPP loan.</w:t>
       </w:r>
     </w:p>
     <w:p>
@@ -736,7 +1381,13 @@
         <w:tab/>
       </w:r>
       <w:r>
-        <w:t xml:space="preserve">Nothing in the CARES Act, SBA Regulations, SOP 50-10, the First Interim Rule or the Second Interim Rule authorizes or permits the SBA to exclude debtors in bankruptcy from the PPP.</w:t>
+        <w:t xml:space="preserve">Nothing in the CARES Act, SBA Regulations, SOP 50</w:t>
+      </w:r>
+      <w:r>
+        <w:noBreakHyphen/>
+      </w:r>
+      <w:r>
+        <w:t xml:space="preserve">10, the First Interim Rule or the Second Interim Rule authorizes or permits the SBA to exclude debtors in bankruptcy from the PPP.</w:t>
       </w:r>
     </w:p>
     <w:p>
@@ -750,7 +1401,13 @@
         <w:tab/>
       </w:r>
       <w:r>
-        <w:t xml:space="preserve">Plaintiff, like many other [businesses] financially affected by the COVID-19 pandemic in ways that could not have been foreseen.</w:t>
+        <w:t xml:space="preserve">Plaintiff, like many other [businesses] financially affected by the COVID</w:t>
+      </w:r>
+      <w:r>
+        <w:noBreakHyphen/>
+      </w:r>
+      <w:r>
+        <w:t xml:space="preserve">19 pandemic in ways that could not have been foreseen.</w:t>
       </w:r>
     </w:p>
     <w:p>
@@ -764,7 +1421,7 @@
         <w:tab/>
       </w:r>
       <w:r>
-        <w:t xml:space="preserve">On March 19, 2020, the Governor of Puerto Rico instituted a quarantine/total closure order for Puerto Rico (the “Quarantine Order”).</w:t>
+        <w:t xml:space="preserve">On March 19, 2020, the Governor of Puerto Rico instituted a quarantine/​total closure order for Puerto Rico (the “Quarantine Order”).</w:t>
       </w:r>
     </w:p>
     <w:p>
@@ -792,7 +1449,7 @@
         <w:tab/>
       </w:r>
       <w:r>
-        <w:t xml:space="preserve">On March 26th, 2020, the governor extended the quarantine/total closure until April 12th, 2020.</w:t>
+        <w:t xml:space="preserve">On March 26th, 2020, the governor extended the quarantine/​total closure until April 12th, 2020.</w:t>
       </w:r>
     </w:p>
     <w:p>
@@ -862,7 +1519,7 @@
         <w:tab/>
       </w:r>
       <w:r>
-        <w:t xml:space="preserve">However, when Plaintiff sought to apply for the PPP, it discovered that the Application would “not be approved” because Plaintiff is presently involved in a bankruptcy. In fact, the Application was “hard-coded” to answer “No” to the bankruptcy question (Question No. 1). Plaintiff submitted a supplemental statement with its Application correcting the hard-coded answer to Question No. 1.</w:t>
+        <w:t xml:space="preserve">However, when Plaintiff sought to apply for the PPP, it discovered that the Application would “not be approved” because Plaintiff is presently involved in a bankruptcy. In fact, the Application was “hard-coded” to answer “No” to the bankruptcy question (Question No. 1). Plaintiff submitted a supplemental statement with its Application correcting the hard-coded answer to Question No. 1.</w:t>
       </w:r>
     </w:p>
     <w:p>
@@ -876,18 +1533,151 @@
         <w:tab/>
       </w:r>
       <w:r>
-        <w:t xml:space="preserve">Plaintiff is requesting this credit on an unsecured basis in accordance with § 364(a) of the Bankruptcy Code and is not required to seek additional authorization from the Bankruptcy Court.</w:t>
+        <w:t xml:space="preserve">Plaintiff is requesting this credit on an unsecured basis in accordance with § 364(a) of the Bankruptcy Code and is not required to seek additional authorization from the Bankruptcy Court.</w:t>
       </w:r>
     </w:p>
     <w:p>
       <w:pPr>
         <w:pStyle w:val="Heading1"/>
-      </w:pPr>
-      <w:bookmarkStart w:id="13" w:name="_d4f64399eec7b0260a24a6c8f494b4ca915daf4"/>
-      <w:r>
-        <w:t xml:space="preserve">V. Count I: Administrative Procedure Act – Exceeds Statutory Authority</w:t>
-      </w:r>
-      <w:bookmarkEnd w:id="13"/>
+        <w:keepNext/>
+        <w:keepLines/>
+        <w:spacing w:before="0" w:after="0" w:line="480" w:lineRule="exact"/>
+        <w:ind w:left="0" w:firstLine="0"/>
+        <w:jc w:val="left"/>
+      </w:pPr>
+      <w:r>
+        <w:rPr>
+          <w:b/>
+          <w:bCs/>
+        </w:rPr>
+        <w:t xml:space="preserve">V.</w:t>
+      </w:r>
+      <w:r>
+        <w:rPr>
+          <w:b/>
+          <w:bCs/>
+        </w:rPr>
+        <w:t xml:space="preserve"> </w:t>
+      </w:r>
+      <w:r>
+        <w:rPr>
+          <w:b/>
+          <w:bCs/>
+        </w:rPr>
+        <w:t xml:space="preserve">COUNT</w:t>
+      </w:r>
+      <w:r>
+        <w:rPr>
+          <w:b/>
+          <w:bCs/>
+        </w:rPr>
+        <w:t xml:space="preserve"> </w:t>
+      </w:r>
+      <w:r>
+        <w:rPr>
+          <w:b/>
+          <w:bCs/>
+        </w:rPr>
+        <w:t xml:space="preserve">I:</w:t>
+      </w:r>
+      <w:r>
+        <w:rPr>
+          <w:b/>
+          <w:bCs/>
+        </w:rPr>
+        <w:t xml:space="preserve"> </w:t>
+      </w:r>
+      <w:r>
+        <w:rPr>
+          <w:b/>
+          <w:bCs/>
+        </w:rPr>
+        <w:t xml:space="preserve">ADMINISTRATIVE</w:t>
+      </w:r>
+      <w:r>
+        <w:rPr>
+          <w:b/>
+          <w:bCs/>
+        </w:rPr>
+        <w:t xml:space="preserve"> </w:t>
+      </w:r>
+      <w:r>
+        <w:rPr>
+          <w:b/>
+          <w:bCs/>
+        </w:rPr>
+        <w:t xml:space="preserve">PROCEDURE</w:t>
+      </w:r>
+      <w:r>
+        <w:rPr>
+          <w:b/>
+          <w:bCs/>
+        </w:rPr>
+        <w:t xml:space="preserve"> </w:t>
+      </w:r>
+      <w:r>
+        <w:rPr>
+          <w:b/>
+          <w:bCs/>
+        </w:rPr>
+        <w:t xml:space="preserve">ACT</w:t>
+      </w:r>
+      <w:r>
+        <w:rPr>
+          <w:b/>
+          <w:bCs/>
+        </w:rPr>
+        <w:t xml:space="preserve"> </w:t>
+      </w:r>
+      <w:r>
+        <w:rPr>
+          <w:b/>
+          <w:bCs/>
+        </w:rPr>
+        <w:t xml:space="preserve">–</w:t>
+      </w:r>
+      <w:r>
+        <w:rPr>
+          <w:b/>
+          <w:bCs/>
+        </w:rPr>
+        <w:t xml:space="preserve"> </w:t>
+      </w:r>
+      <w:r>
+        <w:rPr>
+          <w:b/>
+          <w:bCs/>
+        </w:rPr>
+        <w:t xml:space="preserve">EXCEEDS</w:t>
+      </w:r>
+      <w:r>
+        <w:rPr>
+          <w:b/>
+          <w:bCs/>
+        </w:rPr>
+        <w:t xml:space="preserve"> </w:t>
+      </w:r>
+      <w:r>
+        <w:rPr>
+          <w:b/>
+          <w:bCs/>
+        </w:rPr>
+        <w:t xml:space="preserve">STATUTORY</w:t>
+      </w:r>
+      <w:r>
+        <w:rPr>
+          <w:b/>
+          <w:bCs/>
+        </w:rPr>
+        <w:t xml:space="preserve"> </w:t>
+      </w:r>
+      <w:r>
+        <w:rPr>
+          <w:b/>
+          <w:bCs/>
+        </w:rPr>
+        <w:t xml:space="preserve">AUTHORITY</w:t>
+      </w:r>
     </w:p>
     <w:p>
       <w:pPr>
@@ -906,12 +1696,117 @@
     <w:p>
       <w:pPr>
         <w:pStyle w:val="Heading1"/>
-      </w:pPr>
-      <w:bookmarkStart w:id="14" w:name="_b0e0d9d96d09d364aa5a54054e82d3c7d9c76ba"/>
-      <w:r>
-        <w:t xml:space="preserve">VIII. Count IV: Mandamus Under 28 U.S.C. §1361</w:t>
-      </w:r>
-      <w:bookmarkEnd w:id="14"/>
+        <w:keepNext/>
+        <w:keepLines/>
+        <w:spacing w:before="0" w:after="0" w:line="480" w:lineRule="exact"/>
+        <w:ind w:left="0" w:firstLine="0"/>
+        <w:jc w:val="left"/>
+      </w:pPr>
+      <w:r>
+        <w:rPr>
+          <w:b/>
+          <w:bCs/>
+        </w:rPr>
+        <w:t xml:space="preserve">VIII.</w:t>
+      </w:r>
+      <w:r>
+        <w:rPr>
+          <w:b/>
+          <w:bCs/>
+        </w:rPr>
+        <w:t xml:space="preserve"> </w:t>
+      </w:r>
+      <w:r>
+        <w:rPr>
+          <w:b/>
+          <w:bCs/>
+        </w:rPr>
+        <w:t xml:space="preserve">COUNT</w:t>
+      </w:r>
+      <w:r>
+        <w:rPr>
+          <w:b/>
+          <w:bCs/>
+        </w:rPr>
+        <w:t xml:space="preserve"> </w:t>
+      </w:r>
+      <w:r>
+        <w:rPr>
+          <w:b/>
+          <w:bCs/>
+        </w:rPr>
+        <w:t xml:space="preserve">IV:</w:t>
+      </w:r>
+      <w:r>
+        <w:rPr>
+          <w:b/>
+          <w:bCs/>
+        </w:rPr>
+        <w:t xml:space="preserve"> </w:t>
+      </w:r>
+      <w:r>
+        <w:rPr>
+          <w:b/>
+          <w:bCs/>
+        </w:rPr>
+        <w:t xml:space="preserve">MANDAMUS</w:t>
+      </w:r>
+      <w:r>
+        <w:rPr>
+          <w:b/>
+          <w:bCs/>
+        </w:rPr>
+        <w:t xml:space="preserve"> </w:t>
+      </w:r>
+      <w:r>
+        <w:rPr>
+          <w:b/>
+          <w:bCs/>
+        </w:rPr>
+        <w:t xml:space="preserve">UNDER</w:t>
+      </w:r>
+      <w:r>
+        <w:rPr>
+          <w:b/>
+          <w:bCs/>
+        </w:rPr>
+        <w:t xml:space="preserve"> </w:t>
+      </w:r>
+      <w:r>
+        <w:rPr>
+          <w:b/>
+          <w:bCs/>
+        </w:rPr>
+        <w:t xml:space="preserve">28</w:t>
+      </w:r>
+      <w:r>
+        <w:rPr>
+          <w:b/>
+          <w:bCs/>
+        </w:rPr>
+        <w:t xml:space="preserve"> </w:t>
+      </w:r>
+      <w:r>
+        <w:rPr>
+          <w:b/>
+          <w:bCs/>
+        </w:rPr>
+        <w:t xml:space="preserve">U.S.C.</w:t>
+      </w:r>
+      <w:r>
+        <w:rPr>
+          <w:b/>
+          <w:bCs/>
+        </w:rPr>
+        <w:t xml:space="preserve"> </w:t>
+      </w:r>
+      <w:r>
+        <w:rPr>
+          <w:b/>
+          <w:bCs/>
+        </w:rPr>
+        <w:t xml:space="preserve">§1361</w:t>
+      </w:r>
     </w:p>
     <w:p>
       <w:pPr>
@@ -952,7 +1847,7 @@
         <w:tab/>
       </w:r>
       <w:r>
-        <w:t xml:space="preserve">The Defendants have the non-discretionary duty to comply with the CARES Act and the provisions of the PPP to apply criteria to the PPP that are substantively and/or procedurally valid and to avoid imposing criteria to the PPP that are substantively and/or procedurally ultra vires.</w:t>
+        <w:t xml:space="preserve">The Defendants have the non-discretionary duty to comply with the CARES Act and the provisions of the PPP to apply criteria to the PPP that are substantively and/​or procedurally valid and to avoid imposing criteria to the PPP that are substantively and/​or procedurally ultra vires.</w:t>
       </w:r>
     </w:p>
     <w:p>
@@ -972,16 +1867,65 @@
     <w:p>
       <w:pPr>
         <w:pStyle w:val="Heading1"/>
-      </w:pPr>
-      <w:bookmarkStart w:id="15" w:name="_136848220666050882a1a9207370486ec8dc01e"/>
-      <w:r>
-        <w:t xml:space="preserve">IX. Prayer for Relief</w:t>
-      </w:r>
-      <w:bookmarkEnd w:id="15"/>
-    </w:p>
-    <w:p>
-      <w:pPr>
-        <w:pStyle w:val="FirstParagraph"/>
+        <w:keepNext/>
+        <w:keepLines/>
+        <w:spacing w:before="0" w:after="0" w:line="480" w:lineRule="exact"/>
+        <w:ind w:left="0" w:firstLine="0"/>
+        <w:jc w:val="left"/>
+      </w:pPr>
+      <w:r>
+        <w:rPr>
+          <w:b/>
+          <w:bCs/>
+        </w:rPr>
+        <w:t xml:space="preserve">IX.</w:t>
+      </w:r>
+      <w:r>
+        <w:rPr>
+          <w:b/>
+          <w:bCs/>
+        </w:rPr>
+        <w:t xml:space="preserve"> </w:t>
+      </w:r>
+      <w:r>
+        <w:rPr>
+          <w:b/>
+          <w:bCs/>
+        </w:rPr>
+        <w:t xml:space="preserve">PRAYER</w:t>
+      </w:r>
+      <w:r>
+        <w:rPr>
+          <w:b/>
+          <w:bCs/>
+        </w:rPr>
+        <w:t xml:space="preserve"> </w:t>
+      </w:r>
+      <w:r>
+        <w:rPr>
+          <w:b/>
+          <w:bCs/>
+        </w:rPr>
+        <w:t xml:space="preserve">FOR</w:t>
+      </w:r>
+      <w:r>
+        <w:rPr>
+          <w:b/>
+          <w:bCs/>
+        </w:rPr>
+        <w:t xml:space="preserve"> </w:t>
+      </w:r>
+      <w:r>
+        <w:rPr>
+          <w:b/>
+          <w:bCs/>
+        </w:rPr>
+        <w:t xml:space="preserve">RELIEF</w:t>
+      </w:r>
+    </w:p>
+    <w:p>
+      <w:pPr>
+        <w:pStyle w:val="BodyText"/>
       </w:pPr>
       <w:r>
         <w:rPr>
@@ -996,7 +1940,7 @@
     </w:p>
     <w:p>
       <w:pPr>
-        <w:pStyle w:val="PrayerItem"/>
+        <w:pStyle w:val="LetteredItem"/>
       </w:pPr>
       <w:r>
         <w:t xml:space="preserve">A.</w:t>
@@ -1010,7 +1954,7 @@
     </w:p>
     <w:p>
       <w:pPr>
-        <w:pStyle w:val="PrayerItem"/>
+        <w:pStyle w:val="LetteredItem"/>
       </w:pPr>
       <w:r>
         <w:t xml:space="preserve">B.</w:t>
@@ -1024,7 +1968,7 @@
     </w:p>
     <w:p>
       <w:pPr>
-        <w:pStyle w:val="PrayerItem"/>
+        <w:pStyle w:val="LetteredItem"/>
       </w:pPr>
       <w:r>
         <w:t xml:space="preserve">C.</w:t>
@@ -1038,7 +1982,7 @@
     </w:p>
     <w:p>
       <w:pPr>
-        <w:pStyle w:val="PrayerItem"/>
+        <w:pStyle w:val="LetteredItem"/>
       </w:pPr>
       <w:r>
         <w:t xml:space="preserve">D.</w:t>
@@ -1052,7 +1996,7 @@
     </w:p>
     <w:p>
       <w:pPr>
-        <w:pStyle w:val="PrayerItem"/>
+        <w:pStyle w:val="LetteredItem"/>
       </w:pPr>
       <w:r>
         <w:t xml:space="preserve">E.</w:t>
@@ -1066,7 +2010,7 @@
     </w:p>
     <w:p>
       <w:pPr>
-        <w:pStyle w:val="PrayerItem"/>
+        <w:pStyle w:val="LetteredItem"/>
       </w:pPr>
       <w:r>
         <w:t xml:space="preserve">F.</w:t>
@@ -1080,7 +2024,11 @@
     </w:p>
     <w:p>
       <w:pPr>
-        <w:pStyle w:val="SignatureGap"/>
+        <w:keepNext/>
+        <w:keepLines/>
+        <w:spacing w:before="480" w:after="0" w:line="276" w:lineRule="exact"/>
+        <w:ind w:left="0" w:firstLine="0"/>
+        <w:jc w:val="left"/>
       </w:pPr>
       <w:r>
         <w:t xml:space="preserve">Respectfully submitted,</w:t>
@@ -1088,71 +2036,256 @@
     </w:p>
     <w:p>
       <w:pPr>
-        <w:pStyle w:val="SignatureGap"/>
-      </w:pPr>
-      <w:r>
-        <w:t xml:space="preserve">On this 27th day of April of 2020.</w:t>
-      </w:r>
-    </w:p>
-    <w:p>
-      <w:pPr>
-        <w:pStyle w:val="SignatureIndentGap"/>
-      </w:pPr>
-      <w:r>
-        <w:t xml:space="preserve">/s/ Rafael A. Gonzalez Valiente</w:t>
-      </w:r>
-    </w:p>
-    <w:p>
-      <w:pPr>
-        <w:pStyle w:val="SignatureIndent"/>
-      </w:pPr>
-      <w:r>
-        <w:t xml:space="preserve">USDC# 225209</w:t>
-      </w:r>
-    </w:p>
-    <w:p>
-      <w:pPr>
-        <w:pStyle w:val="SignatureIndent"/>
-      </w:pPr>
-      <w:r>
-        <w:t xml:space="preserve">Counsel for Plaintiff</w:t>
-      </w:r>
-    </w:p>
-    <w:p>
-      <w:pPr>
-        <w:pStyle w:val="SignatureIndent"/>
-      </w:pPr>
-      <w:r>
-        <w:t xml:space="preserve">Godreau &amp; González Law</w:t>
-      </w:r>
-    </w:p>
-    <w:p>
-      <w:pPr>
-        <w:pStyle w:val="SignatureIndent"/>
-      </w:pPr>
-      <w:r>
-        <w:t xml:space="preserve">PO Box 9024176</w:t>
-      </w:r>
-    </w:p>
-    <w:p>
-      <w:pPr>
-        <w:pStyle w:val="SignatureIndent"/>
-      </w:pPr>
-      <w:r>
-        <w:t xml:space="preserve">San Juan, Puerto Rico 00902-4176</w:t>
-      </w:r>
-    </w:p>
-    <w:p>
-      <w:pPr>
-        <w:pStyle w:val="SignatureIndent"/>
-      </w:pPr>
-      <w:r>
-        <w:t xml:space="preserve">Tel : (787)726-0077</w:t>
-      </w:r>
-    </w:p>
-    <w:p>
-      <w:pPr>
-        <w:pStyle w:val="SignatureIndent"/>
+        <w:keepNext/>
+        <w:keepLines/>
+        <w:spacing w:before="276" w:after="0" w:line="276" w:lineRule="exact"/>
+        <w:ind w:left="0" w:firstLine="0"/>
+        <w:jc w:val="left"/>
+      </w:pPr>
+      <w:r>
+        <w:t xml:space="preserve">On</w:t>
+      </w:r>
+      <w:r>
+        <w:t xml:space="preserve"> </w:t>
+      </w:r>
+      <w:r>
+        <w:t xml:space="preserve">this</w:t>
+      </w:r>
+      <w:r>
+        <w:t xml:space="preserve"> </w:t>
+      </w:r>
+      <w:r>
+        <w:t xml:space="preserve">27th</w:t>
+      </w:r>
+      <w:r>
+        <w:t xml:space="preserve"> </w:t>
+      </w:r>
+      <w:r>
+        <w:t xml:space="preserve">day</w:t>
+      </w:r>
+      <w:r>
+        <w:t xml:space="preserve"> </w:t>
+      </w:r>
+      <w:r>
+        <w:t xml:space="preserve">of</w:t>
+      </w:r>
+      <w:r>
+        <w:t xml:space="preserve"> </w:t>
+      </w:r>
+      <w:r>
+        <w:t xml:space="preserve">April</w:t>
+      </w:r>
+      <w:r>
+        <w:t xml:space="preserve"> </w:t>
+      </w:r>
+      <w:r>
+        <w:t xml:space="preserve">of</w:t>
+      </w:r>
+      <w:r>
+        <w:t xml:space="preserve"> </w:t>
+      </w:r>
+      <w:r>
+        <w:t xml:space="preserve">2020.</w:t>
+      </w:r>
+    </w:p>
+    <w:p>
+      <w:pPr>
+        <w:keepNext/>
+        <w:keepLines/>
+        <w:spacing w:before="276" w:after="0" w:line="276" w:lineRule="exact"/>
+        <w:ind w:left="4320" w:firstLine="0"/>
+        <w:jc w:val="left"/>
+      </w:pPr>
+      <w:r>
+        <w:t xml:space="preserve">/s/ </w:t>
+      </w:r>
+      <w:r>
+        <w:t xml:space="preserve">Rafael</w:t>
+      </w:r>
+      <w:r>
+        <w:t xml:space="preserve"> </w:t>
+      </w:r>
+      <w:r>
+        <w:t xml:space="preserve">A.</w:t>
+      </w:r>
+      <w:r>
+        <w:t xml:space="preserve"> </w:t>
+      </w:r>
+      <w:r>
+        <w:t xml:space="preserve">Gonzalez</w:t>
+      </w:r>
+      <w:r>
+        <w:t xml:space="preserve"> </w:t>
+      </w:r>
+      <w:r>
+        <w:t xml:space="preserve">Valiente</w:t>
+      </w:r>
+    </w:p>
+    <w:p>
+      <w:pPr>
+        <w:keepNext/>
+        <w:keepLines/>
+        <w:spacing w:before="0" w:after="0" w:line="276" w:lineRule="exact"/>
+        <w:ind w:left="4320" w:firstLine="0"/>
+        <w:jc w:val="left"/>
+      </w:pPr>
+      <w:r>
+        <w:t xml:space="preserve">USDC#</w:t>
+      </w:r>
+      <w:r>
+        <w:t xml:space="preserve"> </w:t>
+      </w:r>
+      <w:r>
+        <w:t xml:space="preserve">225209</w:t>
+      </w:r>
+    </w:p>
+    <w:p>
+      <w:pPr>
+        <w:keepNext/>
+        <w:keepLines/>
+        <w:spacing w:before="0" w:after="0" w:line="276" w:lineRule="exact"/>
+        <w:ind w:left="4320" w:firstLine="0"/>
+        <w:jc w:val="left"/>
+      </w:pPr>
+      <w:r>
+        <w:t xml:space="preserve">Counsel</w:t>
+      </w:r>
+      <w:r>
+        <w:t xml:space="preserve"> </w:t>
+      </w:r>
+      <w:r>
+        <w:t xml:space="preserve">for</w:t>
+      </w:r>
+      <w:r>
+        <w:t xml:space="preserve"> </w:t>
+      </w:r>
+      <w:r>
+        <w:t xml:space="preserve">Plaintiff</w:t>
+      </w:r>
+    </w:p>
+    <w:p>
+      <w:pPr>
+        <w:keepNext/>
+        <w:keepLines/>
+        <w:spacing w:before="0" w:after="0" w:line="276" w:lineRule="exact"/>
+        <w:ind w:left="4320" w:firstLine="0"/>
+        <w:jc w:val="left"/>
+      </w:pPr>
+      <w:r>
+        <w:t xml:space="preserve">Godreau</w:t>
+      </w:r>
+      <w:r>
+        <w:t xml:space="preserve"> </w:t>
+      </w:r>
+      <w:r>
+        <w:t xml:space="preserve">&amp;</w:t>
+      </w:r>
+      <w:r>
+        <w:t xml:space="preserve"> </w:t>
+      </w:r>
+      <w:r>
+        <w:t xml:space="preserve">González</w:t>
+      </w:r>
+      <w:r>
+        <w:t xml:space="preserve"> </w:t>
+      </w:r>
+      <w:r>
+        <w:t xml:space="preserve">Law</w:t>
+      </w:r>
+    </w:p>
+    <w:p>
+      <w:pPr>
+        <w:keepNext/>
+        <w:keepLines/>
+        <w:spacing w:before="0" w:after="0" w:line="276" w:lineRule="exact"/>
+        <w:ind w:left="4320" w:firstLine="0"/>
+        <w:jc w:val="left"/>
+      </w:pPr>
+      <w:r>
+        <w:t xml:space="preserve">PO</w:t>
+      </w:r>
+      <w:r>
+        <w:t xml:space="preserve"> </w:t>
+      </w:r>
+      <w:r>
+        <w:t xml:space="preserve">Box</w:t>
+      </w:r>
+      <w:r>
+        <w:t xml:space="preserve"> </w:t>
+      </w:r>
+      <w:r>
+        <w:t xml:space="preserve">9024176</w:t>
+      </w:r>
+    </w:p>
+    <w:p>
+      <w:pPr>
+        <w:keepNext/>
+        <w:keepLines/>
+        <w:spacing w:before="0" w:after="0" w:line="276" w:lineRule="exact"/>
+        <w:ind w:left="4320" w:firstLine="0"/>
+        <w:jc w:val="left"/>
+      </w:pPr>
+      <w:r>
+        <w:t xml:space="preserve">San</w:t>
+      </w:r>
+      <w:r>
+        <w:t xml:space="preserve"> </w:t>
+      </w:r>
+      <w:r>
+        <w:t xml:space="preserve">Juan,</w:t>
+      </w:r>
+      <w:r>
+        <w:t xml:space="preserve"> </w:t>
+      </w:r>
+      <w:r>
+        <w:t xml:space="preserve">Puerto</w:t>
+      </w:r>
+      <w:r>
+        <w:t xml:space="preserve"> </w:t>
+      </w:r>
+      <w:r>
+        <w:t xml:space="preserve">Rico</w:t>
+      </w:r>
+      <w:r>
+        <w:t xml:space="preserve"> </w:t>
+      </w:r>
+      <w:r>
+        <w:t xml:space="preserve">00902</w:t>
+        <w:noBreakHyphen/>
+        <w:t xml:space="preserve">4176</w:t>
+      </w:r>
+    </w:p>
+    <w:p>
+      <w:pPr>
+        <w:keepNext/>
+        <w:keepLines/>
+        <w:spacing w:before="0" w:after="0" w:line="276" w:lineRule="exact"/>
+        <w:ind w:left="4320" w:firstLine="0"/>
+        <w:jc w:val="left"/>
+      </w:pPr>
+      <w:r>
+        <w:t xml:space="preserve">Tel</w:t>
+      </w:r>
+      <w:r>
+        <w:t xml:space="preserve"> </w:t>
+      </w:r>
+      <w:r>
+        <w:t xml:space="preserve">:</w:t>
+      </w:r>
+      <w:r>
+        <w:t xml:space="preserve"> </w:t>
+      </w:r>
+      <w:r>
+        <w:t xml:space="preserve">(787)726</w:t>
+        <w:noBreakHyphen/>
+        <w:t xml:space="preserve">0077</w:t>
+      </w:r>
+    </w:p>
+    <w:p>
+      <w:pPr>
+        <w:spacing w:before="0" w:after="0" w:line="276" w:lineRule="exact"/>
+        <w:ind w:left="4320" w:firstLine="0"/>
+        <w:jc w:val="left"/>
       </w:pPr>
       <w:r>
         <w:t xml:space="preserve">rgv@g-glawpr.com</w:t>
@@ -1160,11 +2293,8 @@
     </w:p>
     <w:sectPr>
       <w:footerReference w:type="default" r:id="rIdFooter1"/>
-      <w:footnotePr>
-        <w:numRestart w:val="eachSect"/>
-      </w:footnotePr>
       <w:pgSz w:w="12240" w:h="15840"/>
-      <w:pgMar w:top="1440" w:right="1440" w:bottom="1440" w:left="1440" w:header="720" w:footer="432" w:gutter="0"/>
+      <w:pgMar w:top="1440" w:right="1440" w:bottom="1440" w:left="1440" w:header="720" w:footer="732" w:gutter="0"/>
     </w:sectPr>
   </w:body>
 </w:document>
@@ -1178,7 +2308,7 @@
 <w:ftr xmlns:w="http://schemas.openxmlformats.org/wordprocessingml/2006/main" xmlns:r="http://schemas.openxmlformats.org/officeDocument/2006/relationships">
   <w:p>
     <w:pPr>
-      <w:pStyle w:val="Footer"/>
+      <w:jc w:val="center"/>
     </w:pPr>
     <w:r>
       <w:fldChar w:fldCharType="begin"/>
@@ -1307,19 +2437,48 @@
   <w:docDefaults>
     <w:rPrDefault>
       <w:rPr>
-        <w:rFonts w:ascii="EB Garamond" w:hAnsi="EB Garamond" w:eastAsia="EB Garamond" w:cs="EB Garamond"/>
+        <w:rFonts w:ascii="Liberation Mono" w:hAnsi="Liberation Mono" w:eastAsia="Liberation Mono" w:cs="Liberation Mono"/>
         <w:sz w:val="24"/>
         <w:szCs w:val="24"/>
-        <w:lang w:val="en-US"/>
+        <w:lang w:val="en-US" w:eastAsia="zh-CN" w:bidi="ar-SA"/>
       </w:rPr>
     </w:rPrDefault>
     <w:pPrDefault>
       <w:pPr>
-        <w:spacing w:after="0" w:line="240" w:lineRule="auto"/>
+        <w:widowControl/>
+        <w:spacing w:after="0"/>
       </w:pPr>
     </w:pPrDefault>
   </w:docDefaults>
   <w:latentStyles w:defLockedState="0" w:defUIPriority="0" w:defSemiHidden="0" w:defUnhideWhenUsed="0" w:defQFormat="0" w:count="276"/>
+  <w:style w:type="paragraph" w:default="1" w:styleId="Normal">
+    <w:name w:val="Normal"/>
+    <w:qFormat/>
+  </w:style>
+  <w:style w:type="paragraph" w:styleId="BodyText">
+    <w:name w:val="Body Text"/>
+    <w:basedOn w:val="Normal"/>
+    <w:link w:val="BodyTextChar"/>
+    <w:qFormat/>
+    <w:pPr>
+      <w:spacing w:before="0" w:after="0" w:line="480" w:lineRule="exact"/>
+      <w:ind w:firstLine="720"/>
+    </w:pPr>
+  </w:style>
+  <w:style w:type="paragraph" w:customStyle="1" w:styleId="FirstParagraph">
+    <w:name w:val="First Paragraph"/>
+    <w:basedOn w:val="BodyText"/>
+    <w:next w:val="BodyText"/>
+    <w:qFormat/>
+  </w:style>
+  <w:style w:type="paragraph" w:customStyle="1" w:styleId="Compact">
+    <w:name w:val="Compact"/>
+    <w:basedOn w:val="BodyText"/>
+    <w:qFormat/>
+    <w:pPr>
+      <w:spacing w:before="36" w:after="36"/>
+    </w:pPr>
+  </w:style>
   <w:style w:type="paragraph" w:styleId="Title">
     <w:name w:val="Title"/>
     <w:basedOn w:val="Normal"/>
@@ -1453,6 +2612,84 @@
     <w:pPr/>
     <w:rPr/>
   </w:style>
+  <w:style w:type="paragraph" w:styleId="Heading1">
+    <w:name w:val="heading 1"/>
+    <w:basedOn w:val="Normal"/>
+    <w:next w:val="BodyText"/>
+    <w:link w:val="Heading1Char"/>
+    <w:uiPriority w:val="9"/>
+    <w:qFormat/>
+    <w:rsid w:val="00A10FD9"/>
+    <w:pPr>
+      <w:keepNext/>
+      <w:keepLines/>
+      <w:spacing w:before="0" w:after="0" w:line="480" w:lineRule="exact"/>
+      <w:ind w:firstLine="0"/>
+      <w:jc w:val="center"/>
+      <w:outlineLvl w:val="0"/>
+    </w:pPr>
+    <w:rPr>
+      <w:rFonts w:ascii="Liberation Mono" w:hAnsi="Liberation Mono" w:eastAsia="Liberation Mono" w:cs="Liberation Mono"/>
+      <w:b/>
+      <w:bCs/>
+      <w:caps/>
+      <w:color w:val="000000"/>
+      <w:sz w:val="24"/>
+      <w:szCs w:val="24"/>
+    </w:rPr>
+  </w:style>
+  <w:style w:type="paragraph" w:styleId="Heading2">
+    <w:name w:val="heading 2"/>
+    <w:basedOn w:val="Normal"/>
+    <w:next w:val="BodyText"/>
+    <w:link w:val="Heading2Char"/>
+    <w:uiPriority w:val="9"/>
+    <w:semiHidden/>
+    <w:unhideWhenUsed/>
+    <w:qFormat/>
+    <w:rsid w:val="00A10FD9"/>
+    <w:pPr>
+      <w:keepNext/>
+      <w:keepLines/>
+      <w:spacing w:before="0" w:after="0" w:line="480" w:lineRule="exact"/>
+      <w:ind w:firstLine="0"/>
+      <w:outlineLvl w:val="1"/>
+    </w:pPr>
+    <w:rPr>
+      <w:rFonts w:ascii="Liberation Mono" w:hAnsi="Liberation Mono" w:eastAsia="Liberation Mono" w:cs="Liberation Mono"/>
+      <w:b/>
+      <w:bCs/>
+      <w:color w:val="000000"/>
+      <w:sz w:val="24"/>
+      <w:szCs w:val="24"/>
+    </w:rPr>
+  </w:style>
+  <w:style w:type="paragraph" w:styleId="Heading3">
+    <w:name w:val="heading 3"/>
+    <w:basedOn w:val="Normal"/>
+    <w:next w:val="BodyText"/>
+    <w:link w:val="Heading3Char"/>
+    <w:uiPriority w:val="9"/>
+    <w:semiHidden/>
+    <w:unhideWhenUsed/>
+    <w:qFormat/>
+    <w:rsid w:val="00A10FD9"/>
+    <w:pPr>
+      <w:keepNext/>
+      <w:keepLines/>
+      <w:spacing w:before="0" w:after="0" w:line="480" w:lineRule="exact"/>
+      <w:ind w:firstLine="0"/>
+      <w:outlineLvl w:val="2"/>
+    </w:pPr>
+    <w:rPr>
+      <w:rFonts w:ascii="Liberation Mono" w:hAnsi="Liberation Mono" w:eastAsia="Liberation Mono" w:cs="Liberation Mono"/>
+      <w:b/>
+      <w:bCs/>
+      <w:color w:val="000000"/>
+      <w:sz w:val="24"/>
+      <w:szCs w:val="24"/>
+    </w:rPr>
+  </w:style>
   <w:style w:type="paragraph" w:styleId="Heading4">
     <w:name w:val="heading 4"/>
     <w:basedOn w:val="Normal"/>
@@ -1466,14 +2703,18 @@
     <w:pPr>
       <w:keepNext/>
       <w:keepLines/>
-      <w:spacing w:before="80" w:after="40"/>
+      <w:spacing w:before="0" w:after="0" w:line="480" w:lineRule="exact"/>
+      <w:ind w:firstLine="0"/>
       <w:outlineLvl w:val="3"/>
     </w:pPr>
     <w:rPr>
-      <w:rFonts w:eastAsiaTheme="majorEastAsia" w:cstheme="majorBidi"/>
+      <w:rFonts w:ascii="Liberation Mono" w:hAnsi="Liberation Mono" w:eastAsia="Liberation Mono" w:cs="Liberation Mono"/>
+      <w:b/>
+      <w:bCs/>
       <w:i/>
-      <w:iCs/>
-      <w:color w:val="0F4761" w:themeColor="accent1" w:themeShade="BF"/>
+      <w:color w:val="000000"/>
+      <w:sz w:val="24"/>
+      <w:szCs w:val="24"/>
     </w:rPr>
   </w:style>
   <w:style w:type="paragraph" w:styleId="Heading5">
@@ -1489,12 +2730,18 @@
     <w:pPr>
       <w:keepNext/>
       <w:keepLines/>
-      <w:spacing w:before="80" w:after="40"/>
+      <w:spacing w:before="0" w:after="0" w:line="480" w:lineRule="exact"/>
+      <w:ind w:firstLine="0"/>
       <w:outlineLvl w:val="4"/>
     </w:pPr>
     <w:rPr>
-      <w:rFonts w:eastAsiaTheme="majorEastAsia" w:cstheme="majorBidi"/>
-      <w:color w:val="0F4761" w:themeColor="accent1" w:themeShade="BF"/>
+      <w:rFonts w:ascii="Liberation Mono" w:hAnsi="Liberation Mono" w:eastAsia="Liberation Mono" w:cs="Liberation Mono"/>
+      <w:b/>
+      <w:bCs/>
+      <w:i/>
+      <w:color w:val="000000"/>
+      <w:sz w:val="24"/>
+      <w:szCs w:val="24"/>
     </w:rPr>
   </w:style>
   <w:style w:type="paragraph" w:styleId="Heading6">
@@ -1704,6 +2951,43 @@
       <w:color w:val="272727" w:themeColor="text1" w:themeTint="D8"/>
     </w:rPr>
   </w:style>
+  <w:style w:type="paragraph" w:customStyle="1" w:styleId="ListItem">
+    <w:name w:val="List Item"/>
+    <w:basedOn w:val="BodyText"/>
+    <w:qFormat/>
+    <w:pPr>
+      <w:spacing w:before="0" w:after="0" w:line="480" w:lineRule="exact"/>
+      <w:ind w:left="720" w:hanging="720"/>
+    </w:pPr>
+  </w:style>
+  <w:style w:type="paragraph" w:styleId="BlockText">
+    <w:name w:val="Block Text"/>
+    <w:basedOn w:val="BodyText"/>
+    <w:next w:val="BodyText"/>
+    <w:uiPriority w:val="9"/>
+    <w:unhideWhenUsed/>
+    <w:qFormat/>
+    <w:pPr>
+      <w:spacing w:before="280" w:after="280" w:line="276" w:lineRule="exact"/>
+      <w:ind w:firstLine="0" w:left="720" w:right="720"/>
+    </w:pPr>
+  </w:style>
+  <w:style w:type="paragraph" w:styleId="FootnoteText">
+    <w:name w:val="Footnote Text"/>
+    <w:basedOn w:val="Normal"/>
+    <w:next w:val="FootnoteText"/>
+    <w:uiPriority w:val="9"/>
+    <w:unhideWhenUsed/>
+    <w:qFormat/>
+    <w:pPr>
+      <w:keepLines/>
+      <w:spacing w:before="0" w:after="140" w:line="276" w:lineRule="exact"/>
+    </w:pPr>
+    <w:rPr>
+      <w:sz w:val="24"/>
+      <w:szCs w:val="24"/>
+    </w:rPr>
+  </w:style>
   <w:style w:type="paragraph" w:styleId="FootnoteBlockText">
     <w:name w:val="Footnote Block Text"/>
     <w:basedOn w:val="FootnoteText"/>
@@ -1712,8 +2996,8 @@
     <w:unhideWhenUsed/>
     <w:qFormat/>
     <w:pPr>
-      <w:spacing w:before="100" w:after="100"/>
-      <w:ind w:firstLine="0" w:left="480" w:right="480"/>
+      <w:spacing w:before="280" w:after="280"/>
+      <w:ind w:firstLine="0" w:left="720" w:right="720"/>
     </w:pPr>
   </w:style>
   <w:style w:type="character" w:default="1" w:styleId="DefaultParagraphFont">
@@ -1821,7 +3105,7 @@
     <w:name w:val="Hyperlink"/>
     <w:basedOn w:val="BodyTextChar"/>
     <w:rPr>
-      <w:color w:val="4F81BD" w:themeColor="accent1"/>
+      <w:color w:val="000000"/>
     </w:rPr>
   </w:style>
   <w:style w:type="paragraph" w:styleId="TOCHeading">
@@ -1842,140 +3126,6 @@
       <w:color w:val="365F91" w:themeColor="accent1" w:themeShade="BF"/>
     </w:rPr>
   </w:style>
-  <w:style w:type="paragraph" w:default="1" w:styleId="Normal">
-    <w:name w:val="Normal"/>
-    <w:qFormat/>
-    <w:pPr>
-      <w:widowControl/>
-      <w:spacing w:before="0" w:after="0" w:line="480" w:lineRule="exact"/>
-      <w:ind w:firstLine="0"/>
-      <w:jc w:val="left"/>
-    </w:pPr>
-    <w:rPr>
-      <w:rFonts w:ascii="EB Garamond" w:hAnsi="EB Garamond" w:eastAsia="EB Garamond" w:cs="EB Garamond"/>
-      <w:color w:val="000000"/>
-      <w:sz w:val="24"/>
-      <w:szCs w:val="24"/>
-    </w:rPr>
-  </w:style>
-  <w:style w:type="paragraph" w:styleId="BodyText">
-    <w:name w:val="Body Text"/>
-    <w:basedOn w:val="Normal"/>
-    <w:link w:val="BodyTextChar"/>
-    <w:qFormat/>
-    <w:pPr>
-      <w:spacing w:before="0" w:after="0" w:line="480" w:lineRule="exact"/>
-      <w:ind w:firstLine="720"/>
-    </w:pPr>
-  </w:style>
-  <w:style w:type="paragraph" w:styleId="FirstParagraph">
-    <w:name w:val="First Paragraph"/>
-    <w:basedOn w:val="BodyText"/>
-    <w:next w:val="BodyText"/>
-    <w:qFormat/>
-    <w:pPr>
-      <w:spacing w:before="0" w:after="0" w:line="480" w:lineRule="exact"/>
-      <w:ind w:firstLine="720"/>
-    </w:pPr>
-  </w:style>
-  <w:style w:type="paragraph" w:styleId="Compact">
-    <w:name w:val="Compact"/>
-    <w:basedOn w:val="BodyText"/>
-    <w:qFormat/>
-    <w:pPr>
-      <w:spacing w:before="0" w:after="0" w:line="480" w:lineRule="exact"/>
-      <w:ind w:firstLine="0"/>
-    </w:pPr>
-  </w:style>
-  <w:style w:type="paragraph" w:styleId="BlockText">
-    <w:name w:val="Block Text"/>
-    <w:basedOn w:val="Normal"/>
-    <w:next w:val="BodyText"/>
-    <w:qFormat/>
-    <w:pPr>
-      <w:spacing w:before="0" w:after="204" w:line="276" w:lineRule="exact"/>
-      <w:ind w:left="720" w:right="720" w:firstLine="0"/>
-    </w:pPr>
-  </w:style>
-  <w:style w:type="paragraph" w:styleId="FootnoteText">
-    <w:name w:val="footnote text"/>
-    <w:basedOn w:val="Normal"/>
-    <w:uiPriority w:val="99"/>
-    <w:unhideWhenUsed/>
-    <w:pPr>
-      <w:spacing w:before="0" w:after="96" w:line="276" w:lineRule="exact"/>
-      <w:ind w:firstLine="0"/>
-    </w:pPr>
-    <w:rPr>
-      <w:sz w:val="24"/>
-      <w:szCs w:val="24"/>
-    </w:rPr>
-  </w:style>
-  <w:style w:type="paragraph" w:styleId="Heading1">
-    <w:name w:val="heading 1"/>
-    <w:basedOn w:val="Normal"/>
-    <w:next w:val="BodyText"/>
-    <w:uiPriority w:val="9"/>
-    <w:qFormat/>
-    <w:pPr>
-      <w:keepNext/>
-      <w:keepLines/>
-      <w:spacing w:before="0" w:after="0" w:line="480" w:lineRule="exact"/>
-      <w:ind w:firstLine="0"/>
-      <w:outlineLvl w:val="0"/>
-    </w:pPr>
-    <w:rPr>
-      <w:b/>
-      <w:bCs/>
-      <w:caps/>
-      <w:sz w:val="24"/>
-      <w:szCs w:val="24"/>
-    </w:rPr>
-  </w:style>
-  <w:style w:type="paragraph" w:styleId="Heading2">
-    <w:name w:val="heading 2"/>
-    <w:basedOn w:val="Normal"/>
-    <w:next w:val="BodyText"/>
-    <w:uiPriority w:val="9"/>
-    <w:unhideWhenUsed/>
-    <w:qFormat/>
-    <w:pPr>
-      <w:keepNext/>
-      <w:keepLines/>
-      <w:spacing w:before="0" w:after="0" w:line="480" w:lineRule="exact"/>
-      <w:ind w:firstLine="0"/>
-      <w:outlineLvl w:val="1"/>
-    </w:pPr>
-    <w:rPr>
-      <w:b/>
-      <w:bCs/>
-      <w:sz w:val="24"/>
-      <w:szCs w:val="24"/>
-    </w:rPr>
-  </w:style>
-  <w:style w:type="paragraph" w:styleId="Heading3">
-    <w:name w:val="heading 3"/>
-    <w:basedOn w:val="Normal"/>
-    <w:next w:val="BodyText"/>
-    <w:uiPriority w:val="9"/>
-    <w:unhideWhenUsed/>
-    <w:qFormat/>
-    <w:pPr>
-      <w:keepNext/>
-      <w:keepLines/>
-      <w:spacing w:before="0" w:after="0" w:line="480" w:lineRule="exact"/>
-      <w:ind w:firstLine="0"/>
-      <w:outlineLvl w:val="2"/>
-    </w:pPr>
-    <w:rPr>
-      <w:b/>
-      <w:bCs/>
-      <w:i/>
-      <w:iCs/>
-      <w:sz w:val="24"/>
-      <w:szCs w:val="24"/>
-    </w:rPr>
-  </w:style>
   <w:style w:type="paragraph" w:customStyle="1" w:styleId="NumberedParagraph">
     <w:name w:val="Numbered Paragraph"/>
     <w:basedOn w:val="BodyText"/>
@@ -1988,134 +3138,17 @@
       <w:ind w:firstLine="720"/>
     </w:pPr>
   </w:style>
-  <w:style w:type="paragraph" w:customStyle="1" w:styleId="PrayerItem">
-    <w:name w:val="Prayer Item"/>
-    <w:basedOn w:val="Normal"/>
+  <w:style w:type="paragraph" w:customStyle="1" w:styleId="LetteredItem">
+    <w:name w:val="Lettered Item"/>
+    <w:basedOn w:val="BodyText"/>
     <w:qFormat/>
     <w:pPr>
       <w:tabs>
-        <w:tab w:val="left" w:pos="1584"/>
+        <w:tab w:val="left" w:pos="1440"/>
       </w:tabs>
-      <w:spacing w:before="0" w:after="324" w:line="480" w:lineRule="exact"/>
-      <w:ind w:left="1584" w:hanging="864"/>
+      <w:spacing w:before="0" w:after="0" w:line="480" w:lineRule="exact"/>
+      <w:ind w:left="1440" w:hanging="720"/>
     </w:pPr>
-  </w:style>
-  <w:style w:type="paragraph" w:customStyle="1" w:styleId="CourtTitle">
-    <w:name w:val="Court Title"/>
-    <w:basedOn w:val="Normal"/>
-    <w:qFormat/>
-    <w:pPr>
-      <w:spacing w:before="0" w:after="0" w:line="480" w:lineRule="exact"/>
-      <w:jc w:val="center"/>
-    </w:pPr>
-    <w:rPr>
-      <w:b/>
-      <w:bCs/>
-      <w:caps/>
-    </w:rPr>
-  </w:style>
-  <w:style w:type="paragraph" w:customStyle="1" w:styleId="CourtTitleLast">
-    <w:name w:val="Court Title Last"/>
-    <w:basedOn w:val="CourtTitle"/>
-    <w:qFormat/>
-    <w:pPr>
-      <w:spacing w:before="0" w:after="164" w:line="480" w:lineRule="exact"/>
-    </w:pPr>
-  </w:style>
-  <w:style w:type="paragraph" w:customStyle="1" w:styleId="CaptionTitle">
-    <w:name w:val="Caption Title"/>
-    <w:basedOn w:val="Normal"/>
-    <w:qFormat/>
-    <w:pPr>
-      <w:spacing w:before="0" w:after="0" w:line="480" w:lineRule="exact"/>
-      <w:jc w:val="center"/>
-    </w:pPr>
-    <w:rPr>
-      <w:b/>
-      <w:bCs/>
-    </w:rPr>
-  </w:style>
-  <w:style w:type="paragraph" w:customStyle="1" w:styleId="CaptionText">
-    <w:name w:val="Caption Text"/>
-    <w:basedOn w:val="Normal"/>
-    <w:qFormat/>
-    <w:pPr>
-      <w:spacing w:before="0" w:after="0" w:line="276" w:lineRule="exact"/>
-      <w:ind w:firstLine="0"/>
-    </w:pPr>
-  </w:style>
-  <w:style w:type="paragraph" w:customStyle="1" w:styleId="CaptionRule">
-    <w:name w:val="Caption Rule"/>
-    <w:basedOn w:val="CaptionText"/>
-    <w:qFormat/>
-    <w:pPr>
-      <w:pBdr>
-        <w:bottom w:val="single" w:sz="6" w:space="1" w:color="000000"/>
-      </w:pBdr>
-      <w:spacing w:before="120" w:after="120" w:line="20" w:lineRule="exact"/>
-    </w:pPr>
-  </w:style>
-  <w:style w:type="paragraph" w:customStyle="1" w:styleId="CourtHeading">
-    <w:name w:val="Court Heading"/>
-    <w:basedOn w:val="Normal"/>
-    <w:qFormat/>
-    <w:pPr>
-      <w:keepNext/>
-      <w:keepLines/>
-      <w:spacing w:before="0" w:after="0" w:line="480" w:lineRule="exact"/>
-      <w:ind w:firstLine="0"/>
-    </w:pPr>
-    <w:rPr>
-      <w:b/>
-      <w:bCs/>
-    </w:rPr>
-  </w:style>
-  <w:style w:type="paragraph" w:customStyle="1" w:styleId="SignatureLine">
-    <w:name w:val="Signature Line"/>
-    <w:basedOn w:val="CaptionText"/>
-    <w:qFormat/>
-    <w:pPr>
-      <w:keepNext/>
-      <w:keepLines/>
-    </w:pPr>
-  </w:style>
-  <w:style w:type="paragraph" w:customStyle="1" w:styleId="SignatureGap">
-    <w:name w:val="Signature Gap"/>
-    <w:basedOn w:val="SignatureLine"/>
-    <w:qFormat/>
-    <w:pPr>
-      <w:spacing w:before="324" w:after="0" w:line="276" w:lineRule="exact"/>
-    </w:pPr>
-  </w:style>
-  <w:style w:type="paragraph" w:customStyle="1" w:styleId="SignatureIndent">
-    <w:name w:val="Signature Indent"/>
-    <w:basedOn w:val="SignatureLine"/>
-    <w:qFormat/>
-    <w:pPr>
-      <w:ind w:left="4320" w:firstLine="0"/>
-    </w:pPr>
-  </w:style>
-  <w:style w:type="paragraph" w:customStyle="1" w:styleId="SignatureIndentGap">
-    <w:name w:val="Signature Indent Gap"/>
-    <w:basedOn w:val="SignatureIndent"/>
-    <w:qFormat/>
-    <w:pPr>
-      <w:spacing w:before="324" w:after="0" w:line="276" w:lineRule="exact"/>
-    </w:pPr>
-  </w:style>
-  <w:style w:type="paragraph" w:styleId="Footer">
-    <w:name w:val="footer"/>
-    <w:basedOn w:val="Normal"/>
-    <w:uiPriority w:val="99"/>
-    <w:unhideWhenUsed/>
-    <w:pPr>
-      <w:spacing w:before="0" w:after="0" w:line="240" w:lineRule="auto"/>
-      <w:jc w:val="center"/>
-    </w:pPr>
-    <w:rPr>
-      <w:sz w:val="24"/>
-      <w:szCs w:val="24"/>
-    </w:rPr>
   </w:style>
   <w:style w:type="paragraph" w:customStyle="1" w:styleId="SourceCode">
     <w:name w:val="Source Code"/>

</xml_diff>